<commit_message>
Fix: prefer training parquet over test in find_dataset()
</commit_message>
<xml_diff>
--- a/report_thesis/Project_Documentation.docx
+++ b/report_thesis/Project_Documentation.docx
@@ -953,9 +953,9 @@
     </w:p>
     <w:p>
       <w:r>
-        <w:t>At epsilon=0.01, FGSM drops accuracy from 93.70% to 18.38%.</w:t>
+        <w:t>At epsilon=0.01, FGSM drops accuracy from 93.70% to 18.28%.</w:t>
         <w:br/>
-        <w:t>PGD drops it to 12.42%.</w:t>
+        <w:t>PGD drops it to 12.73%.</w:t>
         <w:br/>
         <w:br/>
         <w:t>Both attacks are devastating. Defenses are essential.</w:t>
@@ -1083,7 +1083,7 @@
           </w:tcPr>
           <w:p>
             <w:r>
-              <w:t>0.1838</w:t>
+              <w:t>0.1828</w:t>
             </w:r>
           </w:p>
         </w:tc>
@@ -1093,7 +1093,7 @@
           </w:tcPr>
           <w:p>
             <w:r>
-              <w:t>0.1645</w:t>
+              <w:t>0.1639</w:t>
             </w:r>
           </w:p>
         </w:tc>
@@ -1103,7 +1103,7 @@
           </w:tcPr>
           <w:p>
             <w:r>
-              <w:t>0.1632</w:t>
+              <w:t>0.1627</w:t>
             </w:r>
           </w:p>
         </w:tc>
@@ -1113,7 +1113,7 @@
           </w:tcPr>
           <w:p>
             <w:r>
-              <w:t>0.1463</w:t>
+              <w:t>0.1460</w:t>
             </w:r>
           </w:p>
         </w:tc>
@@ -1123,7 +1123,7 @@
           </w:tcPr>
           <w:p>
             <w:r>
-              <w:t>0.1304</w:t>
+              <w:t>0.1300</w:t>
             </w:r>
           </w:p>
         </w:tc>
@@ -1135,7 +1135,7 @@
           </w:tcPr>
           <w:p>
             <w:r>
-              <w:t>Adversarial Training</w:t>
+              <w:t>Adversarial Training (RF)</w:t>
             </w:r>
           </w:p>
         </w:tc>
@@ -1145,7 +1145,7 @@
           </w:tcPr>
           <w:p>
             <w:r>
-              <w:t>0.6134</w:t>
+              <w:t>0.6569</w:t>
             </w:r>
           </w:p>
         </w:tc>
@@ -1155,7 +1155,7 @@
           </w:tcPr>
           <w:p>
             <w:r>
-              <w:t>0.2603</w:t>
+              <w:t>0.2927</w:t>
             </w:r>
           </w:p>
         </w:tc>
@@ -1165,7 +1165,7 @@
           </w:tcPr>
           <w:p>
             <w:r>
-              <w:t>0.3394</w:t>
+              <w:t>0.3376</w:t>
             </w:r>
           </w:p>
         </w:tc>
@@ -1175,7 +1175,7 @@
           </w:tcPr>
           <w:p>
             <w:r>
-              <w:t>0.3803</w:t>
+              <w:t>0.3653</w:t>
             </w:r>
           </w:p>
         </w:tc>
@@ -1185,7 +1185,7 @@
           </w:tcPr>
           <w:p>
             <w:r>
-              <w:t>0.2798</w:t>
+              <w:t>0.2740</w:t>
             </w:r>
           </w:p>
         </w:tc>
@@ -1195,7 +1195,7 @@
           </w:tcPr>
           <w:p>
             <w:r>
-              <w:t>0.2373</w:t>
+              <w:t>0.2343</w:t>
             </w:r>
           </w:p>
         </w:tc>
@@ -1227,7 +1227,7 @@
           </w:tcPr>
           <w:p>
             <w:r>
-              <w:t>0.0827</w:t>
+              <w:t>0.0838</w:t>
             </w:r>
           </w:p>
         </w:tc>
@@ -1237,7 +1237,7 @@
           </w:tcPr>
           <w:p>
             <w:r>
-              <w:t>0.0727</w:t>
+              <w:t>0.0725</w:t>
             </w:r>
           </w:p>
         </w:tc>
@@ -1247,7 +1247,7 @@
           </w:tcPr>
           <w:p>
             <w:r>
-              <w:t>0.0585</w:t>
+              <w:t>0.0593</w:t>
             </w:r>
           </w:p>
         </w:tc>
@@ -1257,7 +1257,7 @@
           </w:tcPr>
           <w:p>
             <w:r>
-              <w:t>0.0508</w:t>
+              <w:t>0.0503</w:t>
             </w:r>
           </w:p>
         </w:tc>
@@ -1267,7 +1267,7 @@
           </w:tcPr>
           <w:p>
             <w:r>
-              <w:t>0.0363</w:t>
+              <w:t>0.0370</w:t>
             </w:r>
           </w:p>
         </w:tc>
@@ -1279,7 +1279,7 @@
           </w:tcPr>
           <w:p>
             <w:r>
-              <w:t>Feature Selection</w:t>
+              <w:t>Feature Selection (XGB)</w:t>
             </w:r>
           </w:p>
         </w:tc>
@@ -1299,7 +1299,7 @@
           </w:tcPr>
           <w:p>
             <w:r>
-              <w:t>0.1516</w:t>
+              <w:t>0.1519</w:t>
             </w:r>
           </w:p>
         </w:tc>
@@ -1319,7 +1319,7 @@
           </w:tcPr>
           <w:p>
             <w:r>
-              <w:t>0.0947</w:t>
+              <w:t>0.0946</w:t>
             </w:r>
           </w:p>
         </w:tc>
@@ -1329,7 +1329,7 @@
           </w:tcPr>
           <w:p>
             <w:r>
-              <w:t>0.0998</w:t>
+              <w:t>0.0987</w:t>
             </w:r>
           </w:p>
         </w:tc>
@@ -1339,7 +1339,7 @@
           </w:tcPr>
           <w:p>
             <w:r>
-              <w:t>0.0775</w:t>
+              <w:t>0.0793</w:t>
             </w:r>
           </w:p>
         </w:tc>

</xml_diff>